<commit_message>
Atualiza Documento de Visão e Requisitos
Atualiza o documento Word (.docx) de Visão e Especificação de Requisitos; arquivo binário modificado com revisões de conteúdo.
</commit_message>
<xml_diff>
--- a/Documentação/Documento de Visão e Especificação de Requisitos.docx
+++ b/Documentação/Documento de Visão e Especificação de Requisitos.docx
@@ -1,6 +1,6 @@
 
 <file path=word/document.xml><?xml version="1.0" encoding="utf-8"?>
-<w:document xmlns:wpc="http://schemas.microsoft.com/office/word/2010/wordprocessingCanvas" xmlns:cx="http://schemas.microsoft.com/office/drawing/2014/chartex" xmlns:mc="http://schemas.openxmlformats.org/markup-compatibility/2006" xmlns:o="urn:schemas-microsoft-com:office:office" xmlns:r="http://schemas.openxmlformats.org/officeDocument/2006/relationships" xmlns:m="http://schemas.openxmlformats.org/officeDocument/2006/math" xmlns:v="urn:schemas-microsoft-com:vml" xmlns:wp14="http://schemas.microsoft.com/office/word/2010/wordprocessingDrawing" xmlns:wp="http://schemas.openxmlformats.org/drawingml/2006/wordprocessingDrawing" xmlns:w10="urn:schemas-microsoft-com:office:word" xmlns:w="http://schemas.openxmlformats.org/wordprocessingml/2006/main" xmlns:w14="http://schemas.microsoft.com/office/word/2010/wordml" xmlns:w15="http://schemas.microsoft.com/office/word/2012/wordml" xmlns:w16se="http://schemas.microsoft.com/office/word/2015/wordml/symex" xmlns:wpg="http://schemas.microsoft.com/office/word/2010/wordprocessingGroup" xmlns:wpi="http://schemas.microsoft.com/office/word/2010/wordprocessingInk" xmlns:wne="http://schemas.microsoft.com/office/word/2006/wordml" xmlns:wps="http://schemas.microsoft.com/office/word/2010/wordprocessingShape" mc:Ignorable="w14 w15 w16se wp14">
+<w:document xmlns:wpc="http://schemas.microsoft.com/office/word/2010/wordprocessingCanvas" xmlns:cx="http://schemas.microsoft.com/office/drawing/2014/chartex" xmlns:cx1="http://schemas.microsoft.com/office/drawing/2015/9/8/chartex" xmlns:cx2="http://schemas.microsoft.com/office/drawing/2015/10/21/chartex" xmlns:cx3="http://schemas.microsoft.com/office/drawing/2016/5/9/chartex" xmlns:cx4="http://schemas.microsoft.com/office/drawing/2016/5/10/chartex" xmlns:cx5="http://schemas.microsoft.com/office/drawing/2016/5/11/chartex" xmlns:cx6="http://schemas.microsoft.com/office/drawing/2016/5/12/chartex" xmlns:cx7="http://schemas.microsoft.com/office/drawing/2016/5/13/chartex" xmlns:cx8="http://schemas.microsoft.com/office/drawing/2016/5/14/chartex" xmlns:mc="http://schemas.openxmlformats.org/markup-compatibility/2006" xmlns:aink="http://schemas.microsoft.com/office/drawing/2016/ink" xmlns:am3d="http://schemas.microsoft.com/office/drawing/2017/model3d" xmlns:o="urn:schemas-microsoft-com:office:office" xmlns:oel="http://schemas.microsoft.com/office/2019/extlst" xmlns:r="http://schemas.openxmlformats.org/officeDocument/2006/relationships" xmlns:m="http://schemas.openxmlformats.org/officeDocument/2006/math" xmlns:v="urn:schemas-microsoft-com:vml" xmlns:wp14="http://schemas.microsoft.com/office/word/2010/wordprocessingDrawing" xmlns:wp="http://schemas.openxmlformats.org/drawingml/2006/wordprocessingDrawing" xmlns:w10="urn:schemas-microsoft-com:office:word" xmlns:w="http://schemas.openxmlformats.org/wordprocessingml/2006/main" xmlns:w14="http://schemas.microsoft.com/office/word/2010/wordml" xmlns:w15="http://schemas.microsoft.com/office/word/2012/wordml" xmlns:w16cex="http://schemas.microsoft.com/office/word/2018/wordml/cex" xmlns:w16cid="http://schemas.microsoft.com/office/word/2016/wordml/cid" xmlns:w16="http://schemas.microsoft.com/office/word/2018/wordml" xmlns:w16sdtdh="http://schemas.microsoft.com/office/word/2020/wordml/sdtdatahash" xmlns:w16se="http://schemas.microsoft.com/office/word/2015/wordml/symex" xmlns:wpg="http://schemas.microsoft.com/office/word/2010/wordprocessingGroup" xmlns:wpi="http://schemas.microsoft.com/office/word/2010/wordprocessingInk" xmlns:wne="http://schemas.microsoft.com/office/word/2006/wordml" xmlns:wps="http://schemas.microsoft.com/office/word/2010/wordprocessingShape" mc:Ignorable="w14 w15 w16se w16cid w16 w16cex w16sdtdh wp14">
   <w:body>
     <w:p>
       <w:pPr>
@@ -685,7 +685,6 @@
         <w:t xml:space="preserve">3.1 </w:t>
       </w:r>
       <w:hyperlink r:id="rId14" w:anchor="31-stakeholders">
-        <w:proofErr w:type="spellStart"/>
         <w:r>
           <w:rPr>
             <w:rStyle w:val="Hyperlink"/>
@@ -693,7 +692,6 @@
           </w:rPr>
           <w:t>Stakeholders</w:t>
         </w:r>
-        <w:proofErr w:type="spellEnd"/>
       </w:hyperlink>
     </w:p>
     <w:p>
@@ -705,6 +703,7 @@
         <w:rPr>
           <w:rFonts w:ascii="Aptos" w:eastAsia="Aptos" w:hAnsi="Aptos" w:cs="Aptos"/>
         </w:rPr>
+        <w:lastRenderedPageBreak/>
         <w:t xml:space="preserve">3.2 </w:t>
       </w:r>
       <w:hyperlink r:id="rId15" w:anchor="32-perfis-de-usu%C3%A1rio">
@@ -754,7 +753,6 @@
         <w:rPr>
           <w:rFonts w:ascii="Aptos" w:eastAsia="Aptos" w:hAnsi="Aptos" w:cs="Aptos"/>
         </w:rPr>
-        <w:lastRenderedPageBreak/>
         <w:t xml:space="preserve">4.1 </w:t>
       </w:r>
       <w:hyperlink r:id="rId17" w:anchor="41-m%C3%B3dulo-p%C3%BAblico-e-cliente">
@@ -1263,6 +1261,7 @@
           <w:b/>
           <w:bCs/>
         </w:rPr>
+        <w:lastRenderedPageBreak/>
         <w:t>1.3 Definições, acrônimos e abreviações</w:t>
       </w:r>
     </w:p>
@@ -1278,8 +1277,8 @@
         <w:tblLook w:val="06A0" w:firstRow="1" w:lastRow="0" w:firstColumn="1" w:lastColumn="0" w:noHBand="1" w:noVBand="1"/>
       </w:tblPr>
       <w:tblGrid>
-        <w:gridCol w:w="974"/>
-        <w:gridCol w:w="8036"/>
+        <w:gridCol w:w="968"/>
+        <w:gridCol w:w="8042"/>
       </w:tblGrid>
       <w:tr>
         <w:trPr>
@@ -1374,7 +1373,6 @@
               <w:spacing w:after="0"/>
             </w:pPr>
             <w:r>
-              <w:lastRenderedPageBreak/>
               <w:t>Rifa</w:t>
             </w:r>
           </w:p>
@@ -2029,7 +2027,11 @@
               <w:spacing w:after="0"/>
             </w:pPr>
             <w:r>
-              <w:t>Baixa confiabilidade, falta de transparência e dificuldade de escalar</w:t>
+              <w:t xml:space="preserve">Baixa confiabilidade, falta de transparência e </w:t>
+            </w:r>
+            <w:r>
+              <w:lastRenderedPageBreak/>
+              <w:t>dificuldade de escalar</w:t>
             </w:r>
           </w:p>
         </w:tc>
@@ -2055,6 +2057,7 @@
               <w:spacing w:after="0"/>
             </w:pPr>
             <w:r>
+              <w:lastRenderedPageBreak/>
               <w:t>Uma plataforma automatizada com gestão completa, pagamentos integrados e sorteios auditáveis</w:t>
             </w:r>
           </w:p>
@@ -2072,7 +2075,6 @@
           <w:b/>
           <w:bCs/>
         </w:rPr>
-        <w:lastRenderedPageBreak/>
         <w:t>2.3 Descrição da solução</w:t>
       </w:r>
     </w:p>
@@ -2905,6 +2907,7 @@
               <w:spacing w:after="0"/>
             </w:pPr>
             <w:r>
+              <w:lastRenderedPageBreak/>
               <w:t>Cliente</w:t>
             </w:r>
           </w:p>
@@ -3014,7 +3017,6 @@
               <w:spacing w:after="0"/>
             </w:pPr>
             <w:r>
-              <w:lastRenderedPageBreak/>
               <w:t>Administrador</w:t>
             </w:r>
           </w:p>
@@ -3142,10 +3144,10 @@
         <w:tblLook w:val="06A0" w:firstRow="1" w:lastRow="0" w:firstColumn="1" w:lastColumn="0" w:noHBand="1" w:noVBand="1"/>
       </w:tblPr>
       <w:tblGrid>
-        <w:gridCol w:w="827"/>
-        <w:gridCol w:w="2188"/>
-        <w:gridCol w:w="4568"/>
-        <w:gridCol w:w="1427"/>
+        <w:gridCol w:w="768"/>
+        <w:gridCol w:w="2173"/>
+        <w:gridCol w:w="4693"/>
+        <w:gridCol w:w="1376"/>
       </w:tblGrid>
       <w:tr>
         <w:trPr>
@@ -4065,6 +4067,7 @@
               <w:spacing w:after="0"/>
             </w:pPr>
             <w:r>
+              <w:lastRenderedPageBreak/>
               <w:t>RF08</w:t>
             </w:r>
           </w:p>
@@ -4283,7 +4286,6 @@
               <w:spacing w:after="0"/>
             </w:pPr>
             <w:r>
-              <w:lastRenderedPageBreak/>
               <w:t>RF10</w:t>
             </w:r>
           </w:p>
@@ -4721,10 +4723,10 @@
         <w:tblLook w:val="06A0" w:firstRow="1" w:lastRow="0" w:firstColumn="1" w:lastColumn="0" w:noHBand="1" w:noVBand="1"/>
       </w:tblPr>
       <w:tblGrid>
-        <w:gridCol w:w="827"/>
-        <w:gridCol w:w="1788"/>
-        <w:gridCol w:w="4968"/>
-        <w:gridCol w:w="1427"/>
+        <w:gridCol w:w="768"/>
+        <w:gridCol w:w="1761"/>
+        <w:gridCol w:w="5105"/>
+        <w:gridCol w:w="1376"/>
       </w:tblGrid>
       <w:tr>
         <w:trPr>
@@ -5317,6 +5319,7 @@
               <w:spacing w:after="0"/>
             </w:pPr>
             <w:r>
+              <w:lastRenderedPageBreak/>
               <w:t>RF18</w:t>
             </w:r>
           </w:p>
@@ -5535,7 +5538,6 @@
               <w:spacing w:after="0"/>
             </w:pPr>
             <w:r>
-              <w:lastRenderedPageBreak/>
               <w:t>RF20</w:t>
             </w:r>
           </w:p>
@@ -6191,10 +6193,10 @@
         <w:tblLook w:val="06A0" w:firstRow="1" w:lastRow="0" w:firstColumn="1" w:lastColumn="0" w:noHBand="1" w:noVBand="1"/>
       </w:tblPr>
       <w:tblGrid>
-        <w:gridCol w:w="827"/>
-        <w:gridCol w:w="1565"/>
-        <w:gridCol w:w="5191"/>
-        <w:gridCol w:w="1427"/>
+        <w:gridCol w:w="768"/>
+        <w:gridCol w:w="1561"/>
+        <w:gridCol w:w="5305"/>
+        <w:gridCol w:w="1376"/>
       </w:tblGrid>
       <w:tr>
         <w:trPr>
@@ -6863,11 +6865,11 @@
         <w:tblLook w:val="06A0" w:firstRow="1" w:lastRow="0" w:firstColumn="1" w:lastColumn="0" w:noHBand="1" w:noVBand="1"/>
       </w:tblPr>
       <w:tblGrid>
-        <w:gridCol w:w="1001"/>
-        <w:gridCol w:w="2055"/>
-        <w:gridCol w:w="1948"/>
-        <w:gridCol w:w="2579"/>
-        <w:gridCol w:w="1427"/>
+        <w:gridCol w:w="938"/>
+        <w:gridCol w:w="2052"/>
+        <w:gridCol w:w="1891"/>
+        <w:gridCol w:w="2753"/>
+        <w:gridCol w:w="1376"/>
       </w:tblGrid>
       <w:tr>
         <w:trPr>
@@ -7733,7 +7735,6 @@
               <w:spacing w:after="0"/>
             </w:pPr>
             <w:r>
-              <w:lastRenderedPageBreak/>
               <w:t>RNF06</w:t>
             </w:r>
           </w:p>
@@ -7869,6 +7870,7 @@
               <w:spacing w:after="0"/>
             </w:pPr>
             <w:r>
+              <w:lastRenderedPageBreak/>
               <w:t>RNF07</w:t>
             </w:r>
           </w:p>
@@ -8391,6 +8393,19 @@
       </w:tr>
     </w:tbl>
     <w:p/>
+    <w:p>
+      <w:pPr>
+        <w:pStyle w:val="Ttulo2"/>
+        <w:spacing w:before="299" w:after="299"/>
+        <w:rPr>
+          <w:rFonts w:ascii="Aptos" w:eastAsia="Aptos" w:hAnsi="Aptos" w:cs="Aptos"/>
+          <w:b/>
+          <w:bCs/>
+          <w:sz w:val="36"/>
+          <w:szCs w:val="36"/>
+        </w:rPr>
+      </w:pPr>
+    </w:p>
     <w:p>
       <w:pPr>
         <w:pStyle w:val="Ttulo2"/>
@@ -8430,9 +8445,9 @@
         <w:tblLook w:val="06A0" w:firstRow="1" w:lastRow="0" w:firstColumn="1" w:lastColumn="0" w:noHBand="1" w:noVBand="1"/>
       </w:tblPr>
       <w:tblGrid>
-        <w:gridCol w:w="3187"/>
-        <w:gridCol w:w="2828"/>
-        <w:gridCol w:w="2995"/>
+        <w:gridCol w:w="2899"/>
+        <w:gridCol w:w="3207"/>
+        <w:gridCol w:w="2904"/>
       </w:tblGrid>
       <w:tr>
         <w:trPr>
@@ -8440,7 +8455,7 @@
         </w:trPr>
         <w:tc>
           <w:tcPr>
-            <w:tcW w:w="1249" w:type="dxa"/>
+            <w:tcW w:w="2899" w:type="dxa"/>
             <w:tcBorders>
               <w:top w:val="single" w:sz="6" w:space="0" w:color="000000" w:themeColor="text1"/>
               <w:left w:val="single" w:sz="6" w:space="0" w:color="000000" w:themeColor="text1"/>
@@ -8471,7 +8486,7 @@
         </w:tc>
         <w:tc>
           <w:tcPr>
-            <w:tcW w:w="4409" w:type="dxa"/>
+            <w:tcW w:w="3207" w:type="dxa"/>
             <w:tcBorders>
               <w:top w:val="single" w:sz="6" w:space="0" w:color="000000" w:themeColor="text1"/>
               <w:left w:val="single" w:sz="6" w:space="0" w:color="000000" w:themeColor="text1"/>
@@ -8502,7 +8517,7 @@
         </w:tc>
         <w:tc>
           <w:tcPr>
-            <w:tcW w:w="3358" w:type="dxa"/>
+            <w:tcW w:w="2904" w:type="dxa"/>
             <w:tcBorders>
               <w:top w:val="single" w:sz="6" w:space="0" w:color="000000" w:themeColor="text1"/>
               <w:left w:val="single" w:sz="6" w:space="0" w:color="000000" w:themeColor="text1"/>
@@ -8538,7 +8553,7 @@
         </w:trPr>
         <w:tc>
           <w:tcPr>
-            <w:tcW w:w="1249" w:type="dxa"/>
+            <w:tcW w:w="2899" w:type="dxa"/>
             <w:tcBorders>
               <w:top w:val="single" w:sz="6" w:space="0" w:color="000000" w:themeColor="text1"/>
               <w:left w:val="single" w:sz="6" w:space="0" w:color="000000" w:themeColor="text1"/>
@@ -8568,33 +8583,60 @@
         </w:tc>
         <w:tc>
           <w:tcPr>
-            <w:tcW w:w="4409" w:type="dxa"/>
-            <w:tcBorders>
-              <w:top w:val="single" w:sz="6" w:space="0" w:color="000000" w:themeColor="text1"/>
-              <w:left w:val="single" w:sz="6" w:space="0" w:color="000000" w:themeColor="text1"/>
-              <w:bottom w:val="single" w:sz="6" w:space="0" w:color="000000" w:themeColor="text1"/>
-              <w:right w:val="single" w:sz="6" w:space="0" w:color="000000" w:themeColor="text1"/>
-            </w:tcBorders>
-            <w:tcMar>
-              <w:top w:w="120" w:type="dxa"/>
-              <w:left w:w="120" w:type="dxa"/>
-              <w:bottom w:w="120" w:type="dxa"/>
-              <w:right w:w="120" w:type="dxa"/>
-            </w:tcMar>
-            <w:vAlign w:val="center"/>
-          </w:tcPr>
-          <w:p>
-            <w:pPr>
-              <w:spacing w:after="0"/>
-            </w:pPr>
-            <w:r>
-              <w:t>id, nome, email, cpf, telefone, senha, data_cadastro, status (ativo/bloqueado)</w:t>
-            </w:r>
-          </w:p>
-        </w:tc>
-        <w:tc>
-          <w:tcPr>
-            <w:tcW w:w="3358" w:type="dxa"/>
+            <w:tcW w:w="3207" w:type="dxa"/>
+            <w:tcBorders>
+              <w:top w:val="single" w:sz="6" w:space="0" w:color="000000" w:themeColor="text1"/>
+              <w:left w:val="single" w:sz="6" w:space="0" w:color="000000" w:themeColor="text1"/>
+              <w:bottom w:val="single" w:sz="6" w:space="0" w:color="000000" w:themeColor="text1"/>
+              <w:right w:val="single" w:sz="6" w:space="0" w:color="000000" w:themeColor="text1"/>
+            </w:tcBorders>
+            <w:tcMar>
+              <w:top w:w="120" w:type="dxa"/>
+              <w:left w:w="120" w:type="dxa"/>
+              <w:bottom w:w="120" w:type="dxa"/>
+              <w:right w:w="120" w:type="dxa"/>
+            </w:tcMar>
+            <w:vAlign w:val="center"/>
+          </w:tcPr>
+          <w:p>
+            <w:pPr>
+              <w:spacing w:after="0"/>
+            </w:pPr>
+            <w:proofErr w:type="spellStart"/>
+            <w:r>
+              <w:t>I</w:t>
+            </w:r>
+            <w:r>
+              <w:t>d</w:t>
+            </w:r>
+            <w:r>
+              <w:t>_usuario</w:t>
+            </w:r>
+            <w:proofErr w:type="spellEnd"/>
+            <w:r>
+              <w:t xml:space="preserve">, nome, </w:t>
+            </w:r>
+            <w:proofErr w:type="spellStart"/>
+            <w:r>
+              <w:t>email</w:t>
+            </w:r>
+            <w:proofErr w:type="spellEnd"/>
+            <w:r>
+              <w:t xml:space="preserve">, </w:t>
+            </w:r>
+            <w:proofErr w:type="spellStart"/>
+            <w:r>
+              <w:t>cpf</w:t>
+            </w:r>
+            <w:proofErr w:type="spellEnd"/>
+            <w:r>
+              <w:t>, telefone, senha, data_cadastro, status (ativo/bloqueado)</w:t>
+            </w:r>
+          </w:p>
+        </w:tc>
+        <w:tc>
+          <w:tcPr>
+            <w:tcW w:w="2904" w:type="dxa"/>
             <w:tcBorders>
               <w:top w:val="single" w:sz="6" w:space="0" w:color="000000" w:themeColor="text1"/>
               <w:left w:val="single" w:sz="6" w:space="0" w:color="000000" w:themeColor="text1"/>
@@ -8625,7 +8667,7 @@
         </w:trPr>
         <w:tc>
           <w:tcPr>
-            <w:tcW w:w="1249" w:type="dxa"/>
+            <w:tcW w:w="2899" w:type="dxa"/>
             <w:tcBorders>
               <w:top w:val="single" w:sz="6" w:space="0" w:color="000000" w:themeColor="text1"/>
               <w:left w:val="single" w:sz="6" w:space="0" w:color="000000" w:themeColor="text1"/>
@@ -8655,33 +8697,68 @@
         </w:tc>
         <w:tc>
           <w:tcPr>
-            <w:tcW w:w="4409" w:type="dxa"/>
-            <w:tcBorders>
-              <w:top w:val="single" w:sz="6" w:space="0" w:color="000000" w:themeColor="text1"/>
-              <w:left w:val="single" w:sz="6" w:space="0" w:color="000000" w:themeColor="text1"/>
-              <w:bottom w:val="single" w:sz="6" w:space="0" w:color="000000" w:themeColor="text1"/>
-              <w:right w:val="single" w:sz="6" w:space="0" w:color="000000" w:themeColor="text1"/>
-            </w:tcBorders>
-            <w:tcMar>
-              <w:top w:w="120" w:type="dxa"/>
-              <w:left w:w="120" w:type="dxa"/>
-              <w:bottom w:w="120" w:type="dxa"/>
-              <w:right w:w="120" w:type="dxa"/>
-            </w:tcMar>
-            <w:vAlign w:val="center"/>
-          </w:tcPr>
-          <w:p>
-            <w:pPr>
-              <w:spacing w:after="0"/>
-            </w:pPr>
-            <w:r>
-              <w:t>id, nome, descricao, data_inicio, data_sorteio, valor_bilhete, premio, total_numeros, status (ativa, encerrada)</w:t>
-            </w:r>
-          </w:p>
-        </w:tc>
-        <w:tc>
-          <w:tcPr>
-            <w:tcW w:w="3358" w:type="dxa"/>
+            <w:tcW w:w="3207" w:type="dxa"/>
+            <w:tcBorders>
+              <w:top w:val="single" w:sz="6" w:space="0" w:color="000000" w:themeColor="text1"/>
+              <w:left w:val="single" w:sz="6" w:space="0" w:color="000000" w:themeColor="text1"/>
+              <w:bottom w:val="single" w:sz="6" w:space="0" w:color="000000" w:themeColor="text1"/>
+              <w:right w:val="single" w:sz="6" w:space="0" w:color="000000" w:themeColor="text1"/>
+            </w:tcBorders>
+            <w:tcMar>
+              <w:top w:w="120" w:type="dxa"/>
+              <w:left w:w="120" w:type="dxa"/>
+              <w:bottom w:w="120" w:type="dxa"/>
+              <w:right w:w="120" w:type="dxa"/>
+            </w:tcMar>
+            <w:vAlign w:val="center"/>
+          </w:tcPr>
+          <w:p>
+            <w:pPr>
+              <w:spacing w:after="0"/>
+            </w:pPr>
+            <w:proofErr w:type="spellStart"/>
+            <w:r>
+              <w:t>I</w:t>
+            </w:r>
+            <w:r>
+              <w:t>d</w:t>
+            </w:r>
+            <w:r>
+              <w:t>_rifa</w:t>
+            </w:r>
+            <w:proofErr w:type="spellEnd"/>
+            <w:r>
+              <w:t xml:space="preserve">, nome, </w:t>
+            </w:r>
+            <w:proofErr w:type="spellStart"/>
+            <w:r>
+              <w:t>descricao</w:t>
+            </w:r>
+            <w:proofErr w:type="spellEnd"/>
+            <w:r>
+              <w:t xml:space="preserve">, </w:t>
+            </w:r>
+            <w:proofErr w:type="spellStart"/>
+            <w:r>
+              <w:t>data_inicio</w:t>
+            </w:r>
+            <w:proofErr w:type="spellEnd"/>
+            <w:r>
+              <w:t xml:space="preserve">, data_sorteio, valor_bilhete, </w:t>
+            </w:r>
+            <w:proofErr w:type="gramStart"/>
+            <w:r>
+              <w:t>premio</w:t>
+            </w:r>
+            <w:proofErr w:type="gramEnd"/>
+            <w:r>
+              <w:t>, total_numeros, status (ativa, encerrada)</w:t>
+            </w:r>
+          </w:p>
+        </w:tc>
+        <w:tc>
+          <w:tcPr>
+            <w:tcW w:w="2904" w:type="dxa"/>
             <w:tcBorders>
               <w:top w:val="single" w:sz="6" w:space="0" w:color="000000" w:themeColor="text1"/>
               <w:left w:val="single" w:sz="6" w:space="0" w:color="000000" w:themeColor="text1"/>
@@ -8712,7 +8789,7 @@
         </w:trPr>
         <w:tc>
           <w:tcPr>
-            <w:tcW w:w="1249" w:type="dxa"/>
+            <w:tcW w:w="2899" w:type="dxa"/>
             <w:tcBorders>
               <w:top w:val="single" w:sz="6" w:space="0" w:color="000000" w:themeColor="text1"/>
               <w:left w:val="single" w:sz="6" w:space="0" w:color="000000" w:themeColor="text1"/>
@@ -8742,33 +8819,63 @@
         </w:tc>
         <w:tc>
           <w:tcPr>
-            <w:tcW w:w="4409" w:type="dxa"/>
-            <w:tcBorders>
-              <w:top w:val="single" w:sz="6" w:space="0" w:color="000000" w:themeColor="text1"/>
-              <w:left w:val="single" w:sz="6" w:space="0" w:color="000000" w:themeColor="text1"/>
-              <w:bottom w:val="single" w:sz="6" w:space="0" w:color="000000" w:themeColor="text1"/>
-              <w:right w:val="single" w:sz="6" w:space="0" w:color="000000" w:themeColor="text1"/>
-            </w:tcBorders>
-            <w:tcMar>
-              <w:top w:w="120" w:type="dxa"/>
-              <w:left w:w="120" w:type="dxa"/>
-              <w:bottom w:w="120" w:type="dxa"/>
-              <w:right w:w="120" w:type="dxa"/>
-            </w:tcMar>
-            <w:vAlign w:val="center"/>
-          </w:tcPr>
-          <w:p>
-            <w:pPr>
-              <w:spacing w:after="0"/>
-            </w:pPr>
-            <w:r>
-              <w:t>id, id_rifa, id_usuario, numero, status (reservado, pago, cancelado)</w:t>
-            </w:r>
-          </w:p>
-        </w:tc>
-        <w:tc>
-          <w:tcPr>
-            <w:tcW w:w="3358" w:type="dxa"/>
+            <w:tcW w:w="3207" w:type="dxa"/>
+            <w:tcBorders>
+              <w:top w:val="single" w:sz="6" w:space="0" w:color="000000" w:themeColor="text1"/>
+              <w:left w:val="single" w:sz="6" w:space="0" w:color="000000" w:themeColor="text1"/>
+              <w:bottom w:val="single" w:sz="6" w:space="0" w:color="000000" w:themeColor="text1"/>
+              <w:right w:val="single" w:sz="6" w:space="0" w:color="000000" w:themeColor="text1"/>
+            </w:tcBorders>
+            <w:tcMar>
+              <w:top w:w="120" w:type="dxa"/>
+              <w:left w:w="120" w:type="dxa"/>
+              <w:bottom w:w="120" w:type="dxa"/>
+              <w:right w:w="120" w:type="dxa"/>
+            </w:tcMar>
+            <w:vAlign w:val="center"/>
+          </w:tcPr>
+          <w:p>
+            <w:pPr>
+              <w:spacing w:after="0"/>
+            </w:pPr>
+            <w:proofErr w:type="spellStart"/>
+            <w:r>
+              <w:t>I</w:t>
+            </w:r>
+            <w:r>
+              <w:t>d</w:t>
+            </w:r>
+            <w:r>
+              <w:t>_bilhete</w:t>
+            </w:r>
+            <w:proofErr w:type="spellEnd"/>
+            <w:r>
+              <w:t xml:space="preserve">, </w:t>
+            </w:r>
+            <w:proofErr w:type="spellStart"/>
+            <w:r>
+              <w:t>rifa</w:t>
+            </w:r>
+            <w:r>
+              <w:t>_id</w:t>
+            </w:r>
+            <w:proofErr w:type="spellEnd"/>
+            <w:r>
+              <w:t xml:space="preserve">, </w:t>
+            </w:r>
+            <w:proofErr w:type="spellStart"/>
+            <w:r>
+              <w:t>usuário_id</w:t>
+            </w:r>
+            <w:proofErr w:type="spellEnd"/>
+            <w:r>
+              <w:t>, numero, status (reservado, pago, cancelado)</w:t>
+            </w:r>
+          </w:p>
+        </w:tc>
+        <w:tc>
+          <w:tcPr>
+            <w:tcW w:w="2904" w:type="dxa"/>
             <w:tcBorders>
               <w:top w:val="single" w:sz="6" w:space="0" w:color="000000" w:themeColor="text1"/>
               <w:left w:val="single" w:sz="6" w:space="0" w:color="000000" w:themeColor="text1"/>
@@ -8799,7 +8906,7 @@
         </w:trPr>
         <w:tc>
           <w:tcPr>
-            <w:tcW w:w="1249" w:type="dxa"/>
+            <w:tcW w:w="2899" w:type="dxa"/>
             <w:tcBorders>
               <w:top w:val="single" w:sz="6" w:space="0" w:color="000000" w:themeColor="text1"/>
               <w:left w:val="single" w:sz="6" w:space="0" w:color="000000" w:themeColor="text1"/>
@@ -8824,59 +8931,100 @@
                 <w:bCs/>
               </w:rPr>
               <w:lastRenderedPageBreak/>
-              <w:t>NUMERO</w:t>
-            </w:r>
-          </w:p>
-        </w:tc>
-        <w:tc>
-          <w:tcPr>
-            <w:tcW w:w="4409" w:type="dxa"/>
-            <w:tcBorders>
-              <w:top w:val="single" w:sz="6" w:space="0" w:color="000000" w:themeColor="text1"/>
-              <w:left w:val="single" w:sz="6" w:space="0" w:color="000000" w:themeColor="text1"/>
-              <w:bottom w:val="single" w:sz="6" w:space="0" w:color="000000" w:themeColor="text1"/>
-              <w:right w:val="single" w:sz="6" w:space="0" w:color="000000" w:themeColor="text1"/>
-            </w:tcBorders>
-            <w:tcMar>
-              <w:top w:w="120" w:type="dxa"/>
-              <w:left w:w="120" w:type="dxa"/>
-              <w:bottom w:w="120" w:type="dxa"/>
-              <w:right w:w="120" w:type="dxa"/>
-            </w:tcMar>
-            <w:vAlign w:val="center"/>
-          </w:tcPr>
-          <w:p>
-            <w:pPr>
-              <w:spacing w:after="0"/>
-            </w:pPr>
-            <w:r>
-              <w:t>(parte da entidade BILHETE ou separado para controle) id_rifa, numero, disponivel (bool)</w:t>
-            </w:r>
-          </w:p>
-        </w:tc>
-        <w:tc>
-          <w:tcPr>
-            <w:tcW w:w="3358" w:type="dxa"/>
-            <w:tcBorders>
-              <w:top w:val="single" w:sz="6" w:space="0" w:color="000000" w:themeColor="text1"/>
-              <w:left w:val="single" w:sz="6" w:space="0" w:color="000000" w:themeColor="text1"/>
-              <w:bottom w:val="single" w:sz="6" w:space="0" w:color="000000" w:themeColor="text1"/>
-              <w:right w:val="single" w:sz="6" w:space="0" w:color="000000" w:themeColor="text1"/>
-            </w:tcBorders>
-            <w:tcMar>
-              <w:top w:w="120" w:type="dxa"/>
-              <w:left w:w="120" w:type="dxa"/>
-              <w:bottom w:w="120" w:type="dxa"/>
-              <w:right w:w="120" w:type="dxa"/>
-            </w:tcMar>
-            <w:vAlign w:val="center"/>
-          </w:tcPr>
-          <w:p>
-            <w:pPr>
-              <w:spacing w:after="0"/>
-            </w:pPr>
-            <w:r>
-              <w:t>Relaciona-se com RIFA para controle de disponibilidade</w:t>
+              <w:t>PAGAMENTO</w:t>
+            </w:r>
+          </w:p>
+        </w:tc>
+        <w:tc>
+          <w:tcPr>
+            <w:tcW w:w="3207" w:type="dxa"/>
+            <w:tcBorders>
+              <w:top w:val="single" w:sz="6" w:space="0" w:color="000000" w:themeColor="text1"/>
+              <w:left w:val="single" w:sz="6" w:space="0" w:color="000000" w:themeColor="text1"/>
+              <w:bottom w:val="single" w:sz="6" w:space="0" w:color="000000" w:themeColor="text1"/>
+              <w:right w:val="single" w:sz="6" w:space="0" w:color="000000" w:themeColor="text1"/>
+            </w:tcBorders>
+            <w:tcMar>
+              <w:top w:w="120" w:type="dxa"/>
+              <w:left w:w="120" w:type="dxa"/>
+              <w:bottom w:w="120" w:type="dxa"/>
+              <w:right w:w="120" w:type="dxa"/>
+            </w:tcMar>
+            <w:vAlign w:val="center"/>
+          </w:tcPr>
+          <w:p>
+            <w:pPr>
+              <w:spacing w:after="0"/>
+            </w:pPr>
+            <w:proofErr w:type="spellStart"/>
+            <w:r>
+              <w:t>I</w:t>
+            </w:r>
+            <w:r>
+              <w:t>d</w:t>
+            </w:r>
+            <w:r>
+              <w:t>_pagamento</w:t>
+            </w:r>
+            <w:proofErr w:type="spellEnd"/>
+            <w:r>
+              <w:t xml:space="preserve">, </w:t>
+            </w:r>
+            <w:proofErr w:type="spellStart"/>
+            <w:r>
+              <w:t>usuario</w:t>
+            </w:r>
+            <w:r>
+              <w:t>_id</w:t>
+            </w:r>
+            <w:proofErr w:type="spellEnd"/>
+            <w:r>
+              <w:t xml:space="preserve">, </w:t>
+            </w:r>
+            <w:proofErr w:type="spellStart"/>
+            <w:r>
+              <w:t>rifa</w:t>
+            </w:r>
+            <w:r>
+              <w:t>_id</w:t>
+            </w:r>
+            <w:proofErr w:type="spellEnd"/>
+            <w:r>
+              <w:t>, valor, meio (pix/</w:t>
+            </w:r>
+            <w:proofErr w:type="spellStart"/>
+            <w:r>
+              <w:t>cartao</w:t>
+            </w:r>
+            <w:proofErr w:type="spellEnd"/>
+            <w:r>
+              <w:t>/boleto), status (pendente, pago, falhou), data, transacao_id</w:t>
+            </w:r>
+          </w:p>
+        </w:tc>
+        <w:tc>
+          <w:tcPr>
+            <w:tcW w:w="2904" w:type="dxa"/>
+            <w:tcBorders>
+              <w:top w:val="single" w:sz="6" w:space="0" w:color="000000" w:themeColor="text1"/>
+              <w:left w:val="single" w:sz="6" w:space="0" w:color="000000" w:themeColor="text1"/>
+              <w:bottom w:val="single" w:sz="6" w:space="0" w:color="000000" w:themeColor="text1"/>
+              <w:right w:val="single" w:sz="6" w:space="0" w:color="000000" w:themeColor="text1"/>
+            </w:tcBorders>
+            <w:tcMar>
+              <w:top w:w="120" w:type="dxa"/>
+              <w:left w:w="120" w:type="dxa"/>
+              <w:bottom w:w="120" w:type="dxa"/>
+              <w:right w:w="120" w:type="dxa"/>
+            </w:tcMar>
+            <w:vAlign w:val="center"/>
+          </w:tcPr>
+          <w:p>
+            <w:pPr>
+              <w:spacing w:after="0"/>
+            </w:pPr>
+            <w:r>
+              <w:t>FK usuario, FK rifa; 1:N com BILHETE (um pagamento cobre múltiplos bilhetes)</w:t>
             </w:r>
           </w:p>
         </w:tc>
@@ -8887,7 +9035,7 @@
         </w:trPr>
         <w:tc>
           <w:tcPr>
-            <w:tcW w:w="1249" w:type="dxa"/>
+            <w:tcW w:w="2899" w:type="dxa"/>
             <w:tcBorders>
               <w:top w:val="single" w:sz="6" w:space="0" w:color="000000" w:themeColor="text1"/>
               <w:left w:val="single" w:sz="6" w:space="0" w:color="000000" w:themeColor="text1"/>
@@ -8911,59 +9059,81 @@
                 <w:b/>
                 <w:bCs/>
               </w:rPr>
-              <w:t>PAGAMENTO</w:t>
-            </w:r>
-          </w:p>
-        </w:tc>
-        <w:tc>
-          <w:tcPr>
-            <w:tcW w:w="4409" w:type="dxa"/>
-            <w:tcBorders>
-              <w:top w:val="single" w:sz="6" w:space="0" w:color="000000" w:themeColor="text1"/>
-              <w:left w:val="single" w:sz="6" w:space="0" w:color="000000" w:themeColor="text1"/>
-              <w:bottom w:val="single" w:sz="6" w:space="0" w:color="000000" w:themeColor="text1"/>
-              <w:right w:val="single" w:sz="6" w:space="0" w:color="000000" w:themeColor="text1"/>
-            </w:tcBorders>
-            <w:tcMar>
-              <w:top w:w="120" w:type="dxa"/>
-              <w:left w:w="120" w:type="dxa"/>
-              <w:bottom w:w="120" w:type="dxa"/>
-              <w:right w:w="120" w:type="dxa"/>
-            </w:tcMar>
-            <w:vAlign w:val="center"/>
-          </w:tcPr>
-          <w:p>
-            <w:pPr>
-              <w:spacing w:after="0"/>
-            </w:pPr>
-            <w:r>
-              <w:t>id, id_usuario, id_rifa, valor, meio (pix/cartao/boleto), status (pendente, pago, falhou), data, transacao_id</w:t>
-            </w:r>
-          </w:p>
-        </w:tc>
-        <w:tc>
-          <w:tcPr>
-            <w:tcW w:w="3358" w:type="dxa"/>
-            <w:tcBorders>
-              <w:top w:val="single" w:sz="6" w:space="0" w:color="000000" w:themeColor="text1"/>
-              <w:left w:val="single" w:sz="6" w:space="0" w:color="000000" w:themeColor="text1"/>
-              <w:bottom w:val="single" w:sz="6" w:space="0" w:color="000000" w:themeColor="text1"/>
-              <w:right w:val="single" w:sz="6" w:space="0" w:color="000000" w:themeColor="text1"/>
-            </w:tcBorders>
-            <w:tcMar>
-              <w:top w:w="120" w:type="dxa"/>
-              <w:left w:w="120" w:type="dxa"/>
-              <w:bottom w:w="120" w:type="dxa"/>
-              <w:right w:w="120" w:type="dxa"/>
-            </w:tcMar>
-            <w:vAlign w:val="center"/>
-          </w:tcPr>
-          <w:p>
-            <w:pPr>
-              <w:spacing w:after="0"/>
-            </w:pPr>
-            <w:r>
-              <w:t>FK usuario, FK rifa; 1:N com BILHETE (um pagamento cobre múltiplos bilhetes)</w:t>
+              <w:t>REGISTRO_PAGAMENTO</w:t>
+            </w:r>
+          </w:p>
+        </w:tc>
+        <w:tc>
+          <w:tcPr>
+            <w:tcW w:w="3207" w:type="dxa"/>
+            <w:tcBorders>
+              <w:top w:val="single" w:sz="6" w:space="0" w:color="000000" w:themeColor="text1"/>
+              <w:left w:val="single" w:sz="6" w:space="0" w:color="000000" w:themeColor="text1"/>
+              <w:bottom w:val="single" w:sz="6" w:space="0" w:color="000000" w:themeColor="text1"/>
+              <w:right w:val="single" w:sz="6" w:space="0" w:color="000000" w:themeColor="text1"/>
+            </w:tcBorders>
+            <w:tcMar>
+              <w:top w:w="120" w:type="dxa"/>
+              <w:left w:w="120" w:type="dxa"/>
+              <w:bottom w:w="120" w:type="dxa"/>
+              <w:right w:w="120" w:type="dxa"/>
+            </w:tcMar>
+            <w:vAlign w:val="center"/>
+          </w:tcPr>
+          <w:p>
+            <w:pPr>
+              <w:spacing w:after="0"/>
+            </w:pPr>
+            <w:r>
+              <w:t xml:space="preserve">(pode ser log de integração) </w:t>
+            </w:r>
+            <w:proofErr w:type="spellStart"/>
+            <w:r>
+              <w:t>id</w:t>
+            </w:r>
+            <w:r>
+              <w:t>_registro_pagamento</w:t>
+            </w:r>
+            <w:proofErr w:type="spellEnd"/>
+            <w:r>
+              <w:t xml:space="preserve">, </w:t>
+            </w:r>
+            <w:proofErr w:type="spellStart"/>
+            <w:r>
+              <w:t>pagamento</w:t>
+            </w:r>
+            <w:r>
+              <w:t>_id</w:t>
+            </w:r>
+            <w:proofErr w:type="spellEnd"/>
+            <w:r>
+              <w:t>, status_gateway, resposta_gateway, data</w:t>
+            </w:r>
+          </w:p>
+        </w:tc>
+        <w:tc>
+          <w:tcPr>
+            <w:tcW w:w="2904" w:type="dxa"/>
+            <w:tcBorders>
+              <w:top w:val="single" w:sz="6" w:space="0" w:color="000000" w:themeColor="text1"/>
+              <w:left w:val="single" w:sz="6" w:space="0" w:color="000000" w:themeColor="text1"/>
+              <w:bottom w:val="single" w:sz="6" w:space="0" w:color="000000" w:themeColor="text1"/>
+              <w:right w:val="single" w:sz="6" w:space="0" w:color="000000" w:themeColor="text1"/>
+            </w:tcBorders>
+            <w:tcMar>
+              <w:top w:w="120" w:type="dxa"/>
+              <w:left w:w="120" w:type="dxa"/>
+              <w:bottom w:w="120" w:type="dxa"/>
+              <w:right w:w="120" w:type="dxa"/>
+            </w:tcMar>
+            <w:vAlign w:val="center"/>
+          </w:tcPr>
+          <w:p>
+            <w:pPr>
+              <w:spacing w:after="0"/>
+            </w:pPr>
+            <w:r>
+              <w:t>FK pagamento</w:t>
             </w:r>
           </w:p>
         </w:tc>
@@ -8974,7 +9144,7 @@
         </w:trPr>
         <w:tc>
           <w:tcPr>
-            <w:tcW w:w="1249" w:type="dxa"/>
+            <w:tcW w:w="2899" w:type="dxa"/>
             <w:tcBorders>
               <w:top w:val="single" w:sz="6" w:space="0" w:color="000000" w:themeColor="text1"/>
               <w:left w:val="single" w:sz="6" w:space="0" w:color="000000" w:themeColor="text1"/>
@@ -8998,59 +9168,103 @@
                 <w:b/>
                 <w:bCs/>
               </w:rPr>
-              <w:t>REGISTRO_PAGAMENTO</w:t>
-            </w:r>
-          </w:p>
-        </w:tc>
-        <w:tc>
-          <w:tcPr>
-            <w:tcW w:w="4409" w:type="dxa"/>
-            <w:tcBorders>
-              <w:top w:val="single" w:sz="6" w:space="0" w:color="000000" w:themeColor="text1"/>
-              <w:left w:val="single" w:sz="6" w:space="0" w:color="000000" w:themeColor="text1"/>
-              <w:bottom w:val="single" w:sz="6" w:space="0" w:color="000000" w:themeColor="text1"/>
-              <w:right w:val="single" w:sz="6" w:space="0" w:color="000000" w:themeColor="text1"/>
-            </w:tcBorders>
-            <w:tcMar>
-              <w:top w:w="120" w:type="dxa"/>
-              <w:left w:w="120" w:type="dxa"/>
-              <w:bottom w:w="120" w:type="dxa"/>
-              <w:right w:w="120" w:type="dxa"/>
-            </w:tcMar>
-            <w:vAlign w:val="center"/>
-          </w:tcPr>
-          <w:p>
-            <w:pPr>
-              <w:spacing w:after="0"/>
-            </w:pPr>
-            <w:r>
-              <w:t>(pode ser log de integração) id, id_pagamento, status_gateway, resposta_gateway, data</w:t>
-            </w:r>
-          </w:p>
-        </w:tc>
-        <w:tc>
-          <w:tcPr>
-            <w:tcW w:w="3358" w:type="dxa"/>
-            <w:tcBorders>
-              <w:top w:val="single" w:sz="6" w:space="0" w:color="000000" w:themeColor="text1"/>
-              <w:left w:val="single" w:sz="6" w:space="0" w:color="000000" w:themeColor="text1"/>
-              <w:bottom w:val="single" w:sz="6" w:space="0" w:color="000000" w:themeColor="text1"/>
-              <w:right w:val="single" w:sz="6" w:space="0" w:color="000000" w:themeColor="text1"/>
-            </w:tcBorders>
-            <w:tcMar>
-              <w:top w:w="120" w:type="dxa"/>
-              <w:left w:w="120" w:type="dxa"/>
-              <w:bottom w:w="120" w:type="dxa"/>
-              <w:right w:w="120" w:type="dxa"/>
-            </w:tcMar>
-            <w:vAlign w:val="center"/>
-          </w:tcPr>
-          <w:p>
-            <w:pPr>
-              <w:spacing w:after="0"/>
-            </w:pPr>
-            <w:r>
-              <w:t>FK pagamento</w:t>
+              <w:t>REEMBOLSO</w:t>
+            </w:r>
+          </w:p>
+        </w:tc>
+        <w:tc>
+          <w:tcPr>
+            <w:tcW w:w="3207" w:type="dxa"/>
+            <w:tcBorders>
+              <w:top w:val="single" w:sz="6" w:space="0" w:color="000000" w:themeColor="text1"/>
+              <w:left w:val="single" w:sz="6" w:space="0" w:color="000000" w:themeColor="text1"/>
+              <w:bottom w:val="single" w:sz="6" w:space="0" w:color="000000" w:themeColor="text1"/>
+              <w:right w:val="single" w:sz="6" w:space="0" w:color="000000" w:themeColor="text1"/>
+            </w:tcBorders>
+            <w:tcMar>
+              <w:top w:w="120" w:type="dxa"/>
+              <w:left w:w="120" w:type="dxa"/>
+              <w:bottom w:w="120" w:type="dxa"/>
+              <w:right w:w="120" w:type="dxa"/>
+            </w:tcMar>
+            <w:vAlign w:val="center"/>
+          </w:tcPr>
+          <w:p>
+            <w:pPr>
+              <w:spacing w:after="0"/>
+            </w:pPr>
+            <w:proofErr w:type="spellStart"/>
+            <w:r>
+              <w:t>I</w:t>
+            </w:r>
+            <w:r>
+              <w:t>d</w:t>
+            </w:r>
+            <w:r>
+              <w:t>_reembolso</w:t>
+            </w:r>
+            <w:proofErr w:type="spellEnd"/>
+            <w:r>
+              <w:t xml:space="preserve">, </w:t>
+            </w:r>
+            <w:proofErr w:type="spellStart"/>
+            <w:r>
+              <w:t>usuario</w:t>
+            </w:r>
+            <w:r>
+              <w:t>_id</w:t>
+            </w:r>
+            <w:proofErr w:type="spellEnd"/>
+            <w:r>
+              <w:t xml:space="preserve">, </w:t>
+            </w:r>
+            <w:proofErr w:type="spellStart"/>
+            <w:r>
+              <w:t>rifa</w:t>
+            </w:r>
+            <w:r>
+              <w:t>_id</w:t>
+            </w:r>
+            <w:proofErr w:type="spellEnd"/>
+            <w:r>
+              <w:t xml:space="preserve">, </w:t>
+            </w:r>
+            <w:proofErr w:type="spellStart"/>
+            <w:r>
+              <w:t>bilhete</w:t>
+            </w:r>
+            <w:r>
+              <w:t>_id</w:t>
+            </w:r>
+            <w:proofErr w:type="spellEnd"/>
+            <w:r>
+              <w:t>, motivo, status (solicitado, aprovado, negado), data</w:t>
+            </w:r>
+          </w:p>
+        </w:tc>
+        <w:tc>
+          <w:tcPr>
+            <w:tcW w:w="2904" w:type="dxa"/>
+            <w:tcBorders>
+              <w:top w:val="single" w:sz="6" w:space="0" w:color="000000" w:themeColor="text1"/>
+              <w:left w:val="single" w:sz="6" w:space="0" w:color="000000" w:themeColor="text1"/>
+              <w:bottom w:val="single" w:sz="6" w:space="0" w:color="000000" w:themeColor="text1"/>
+              <w:right w:val="single" w:sz="6" w:space="0" w:color="000000" w:themeColor="text1"/>
+            </w:tcBorders>
+            <w:tcMar>
+              <w:top w:w="120" w:type="dxa"/>
+              <w:left w:w="120" w:type="dxa"/>
+              <w:bottom w:w="120" w:type="dxa"/>
+              <w:right w:w="120" w:type="dxa"/>
+            </w:tcMar>
+            <w:vAlign w:val="center"/>
+          </w:tcPr>
+          <w:p>
+            <w:pPr>
+              <w:spacing w:after="0"/>
+            </w:pPr>
+            <w:r>
+              <w:t>FK usuario, FK rifa, FK bilhete</w:t>
             </w:r>
           </w:p>
         </w:tc>
@@ -9061,7 +9275,7 @@
         </w:trPr>
         <w:tc>
           <w:tcPr>
-            <w:tcW w:w="1249" w:type="dxa"/>
+            <w:tcW w:w="2899" w:type="dxa"/>
             <w:tcBorders>
               <w:top w:val="single" w:sz="6" w:space="0" w:color="000000" w:themeColor="text1"/>
               <w:left w:val="single" w:sz="6" w:space="0" w:color="000000" w:themeColor="text1"/>
@@ -9085,59 +9299,97 @@
                 <w:b/>
                 <w:bCs/>
               </w:rPr>
-              <w:t>REEMBOLSO</w:t>
-            </w:r>
-          </w:p>
-        </w:tc>
-        <w:tc>
-          <w:tcPr>
-            <w:tcW w:w="4409" w:type="dxa"/>
-            <w:tcBorders>
-              <w:top w:val="single" w:sz="6" w:space="0" w:color="000000" w:themeColor="text1"/>
-              <w:left w:val="single" w:sz="6" w:space="0" w:color="000000" w:themeColor="text1"/>
-              <w:bottom w:val="single" w:sz="6" w:space="0" w:color="000000" w:themeColor="text1"/>
-              <w:right w:val="single" w:sz="6" w:space="0" w:color="000000" w:themeColor="text1"/>
-            </w:tcBorders>
-            <w:tcMar>
-              <w:top w:w="120" w:type="dxa"/>
-              <w:left w:w="120" w:type="dxa"/>
-              <w:bottom w:w="120" w:type="dxa"/>
-              <w:right w:w="120" w:type="dxa"/>
-            </w:tcMar>
-            <w:vAlign w:val="center"/>
-          </w:tcPr>
-          <w:p>
-            <w:pPr>
-              <w:spacing w:after="0"/>
-            </w:pPr>
-            <w:r>
-              <w:t>id, id_usuario, id_rifa, id_bilhete, motivo, status (solicitado, aprovado, negado), data</w:t>
-            </w:r>
-          </w:p>
-        </w:tc>
-        <w:tc>
-          <w:tcPr>
-            <w:tcW w:w="3358" w:type="dxa"/>
-            <w:tcBorders>
-              <w:top w:val="single" w:sz="6" w:space="0" w:color="000000" w:themeColor="text1"/>
-              <w:left w:val="single" w:sz="6" w:space="0" w:color="000000" w:themeColor="text1"/>
-              <w:bottom w:val="single" w:sz="6" w:space="0" w:color="000000" w:themeColor="text1"/>
-              <w:right w:val="single" w:sz="6" w:space="0" w:color="000000" w:themeColor="text1"/>
-            </w:tcBorders>
-            <w:tcMar>
-              <w:top w:w="120" w:type="dxa"/>
-              <w:left w:w="120" w:type="dxa"/>
-              <w:bottom w:w="120" w:type="dxa"/>
-              <w:right w:w="120" w:type="dxa"/>
-            </w:tcMar>
-            <w:vAlign w:val="center"/>
-          </w:tcPr>
-          <w:p>
-            <w:pPr>
-              <w:spacing w:after="0"/>
-            </w:pPr>
-            <w:r>
-              <w:t>FK usuario, FK rifa, FK bilhete</w:t>
+              <w:t>SORTEIO</w:t>
+            </w:r>
+          </w:p>
+        </w:tc>
+        <w:tc>
+          <w:tcPr>
+            <w:tcW w:w="3207" w:type="dxa"/>
+            <w:tcBorders>
+              <w:top w:val="single" w:sz="6" w:space="0" w:color="000000" w:themeColor="text1"/>
+              <w:left w:val="single" w:sz="6" w:space="0" w:color="000000" w:themeColor="text1"/>
+              <w:bottom w:val="single" w:sz="6" w:space="0" w:color="000000" w:themeColor="text1"/>
+              <w:right w:val="single" w:sz="6" w:space="0" w:color="000000" w:themeColor="text1"/>
+            </w:tcBorders>
+            <w:tcMar>
+              <w:top w:w="120" w:type="dxa"/>
+              <w:left w:w="120" w:type="dxa"/>
+              <w:bottom w:w="120" w:type="dxa"/>
+              <w:right w:w="120" w:type="dxa"/>
+            </w:tcMar>
+            <w:vAlign w:val="center"/>
+          </w:tcPr>
+          <w:p>
+            <w:pPr>
+              <w:spacing w:after="0"/>
+            </w:pPr>
+            <w:proofErr w:type="spellStart"/>
+            <w:r>
+              <w:t>I</w:t>
+            </w:r>
+            <w:r>
+              <w:t>d</w:t>
+            </w:r>
+            <w:r>
+              <w:t>_sorteio</w:t>
+            </w:r>
+            <w:proofErr w:type="spellEnd"/>
+            <w:r>
+              <w:t xml:space="preserve">, </w:t>
+            </w:r>
+            <w:proofErr w:type="spellStart"/>
+            <w:r>
+              <w:t>rifa</w:t>
+            </w:r>
+            <w:r>
+              <w:t>_id</w:t>
+            </w:r>
+            <w:proofErr w:type="spellEnd"/>
+            <w:r>
+              <w:t xml:space="preserve">, </w:t>
+            </w:r>
+            <w:proofErr w:type="spellStart"/>
+            <w:r>
+              <w:t>data_sorteio</w:t>
+            </w:r>
+            <w:proofErr w:type="spellEnd"/>
+            <w:r>
+              <w:t xml:space="preserve">, </w:t>
+            </w:r>
+            <w:proofErr w:type="spellStart"/>
+            <w:r>
+              <w:t>metodo_sorteio</w:t>
+            </w:r>
+            <w:proofErr w:type="spellEnd"/>
+            <w:r>
+              <w:t xml:space="preserve"> (manual/auto/loteria), resultado (numero sorteado, id_vencedor)</w:t>
+            </w:r>
+          </w:p>
+        </w:tc>
+        <w:tc>
+          <w:tcPr>
+            <w:tcW w:w="2904" w:type="dxa"/>
+            <w:tcBorders>
+              <w:top w:val="single" w:sz="6" w:space="0" w:color="000000" w:themeColor="text1"/>
+              <w:left w:val="single" w:sz="6" w:space="0" w:color="000000" w:themeColor="text1"/>
+              <w:bottom w:val="single" w:sz="6" w:space="0" w:color="000000" w:themeColor="text1"/>
+              <w:right w:val="single" w:sz="6" w:space="0" w:color="000000" w:themeColor="text1"/>
+            </w:tcBorders>
+            <w:tcMar>
+              <w:top w:w="120" w:type="dxa"/>
+              <w:left w:w="120" w:type="dxa"/>
+              <w:bottom w:w="120" w:type="dxa"/>
+              <w:right w:w="120" w:type="dxa"/>
+            </w:tcMar>
+            <w:vAlign w:val="center"/>
+          </w:tcPr>
+          <w:p>
+            <w:pPr>
+              <w:spacing w:after="0"/>
+            </w:pPr>
+            <w:r>
+              <w:t>FK rifa, FK usuario (vencedor)</w:t>
             </w:r>
           </w:p>
         </w:tc>
@@ -9148,7 +9400,7 @@
         </w:trPr>
         <w:tc>
           <w:tcPr>
-            <w:tcW w:w="1249" w:type="dxa"/>
+            <w:tcW w:w="2899" w:type="dxa"/>
             <w:tcBorders>
               <w:top w:val="single" w:sz="6" w:space="0" w:color="000000" w:themeColor="text1"/>
               <w:left w:val="single" w:sz="6" w:space="0" w:color="000000" w:themeColor="text1"/>
@@ -9172,59 +9424,89 @@
                 <w:b/>
                 <w:bCs/>
               </w:rPr>
-              <w:t>SORTEIO</w:t>
-            </w:r>
-          </w:p>
-        </w:tc>
-        <w:tc>
-          <w:tcPr>
-            <w:tcW w:w="4409" w:type="dxa"/>
-            <w:tcBorders>
-              <w:top w:val="single" w:sz="6" w:space="0" w:color="000000" w:themeColor="text1"/>
-              <w:left w:val="single" w:sz="6" w:space="0" w:color="000000" w:themeColor="text1"/>
-              <w:bottom w:val="single" w:sz="6" w:space="0" w:color="000000" w:themeColor="text1"/>
-              <w:right w:val="single" w:sz="6" w:space="0" w:color="000000" w:themeColor="text1"/>
-            </w:tcBorders>
-            <w:tcMar>
-              <w:top w:w="120" w:type="dxa"/>
-              <w:left w:w="120" w:type="dxa"/>
-              <w:bottom w:w="120" w:type="dxa"/>
-              <w:right w:w="120" w:type="dxa"/>
-            </w:tcMar>
-            <w:vAlign w:val="center"/>
-          </w:tcPr>
-          <w:p>
-            <w:pPr>
-              <w:spacing w:after="0"/>
-            </w:pPr>
-            <w:r>
-              <w:t>id, id_rifa, data_sorteio, metodo_sorteio (manual/auto/loteria), resultado (numero sorteado, id_vencedor)</w:t>
-            </w:r>
-          </w:p>
-        </w:tc>
-        <w:tc>
-          <w:tcPr>
-            <w:tcW w:w="3358" w:type="dxa"/>
-            <w:tcBorders>
-              <w:top w:val="single" w:sz="6" w:space="0" w:color="000000" w:themeColor="text1"/>
-              <w:left w:val="single" w:sz="6" w:space="0" w:color="000000" w:themeColor="text1"/>
-              <w:bottom w:val="single" w:sz="6" w:space="0" w:color="000000" w:themeColor="text1"/>
-              <w:right w:val="single" w:sz="6" w:space="0" w:color="000000" w:themeColor="text1"/>
-            </w:tcBorders>
-            <w:tcMar>
-              <w:top w:w="120" w:type="dxa"/>
-              <w:left w:w="120" w:type="dxa"/>
-              <w:bottom w:w="120" w:type="dxa"/>
-              <w:right w:w="120" w:type="dxa"/>
-            </w:tcMar>
-            <w:vAlign w:val="center"/>
-          </w:tcPr>
-          <w:p>
-            <w:pPr>
-              <w:spacing w:after="0"/>
-            </w:pPr>
-            <w:r>
-              <w:t>FK rifa, FK usuario (vencedor)</w:t>
+              <w:t>RESULTADO_SORTEIO</w:t>
+            </w:r>
+          </w:p>
+        </w:tc>
+        <w:tc>
+          <w:tcPr>
+            <w:tcW w:w="3207" w:type="dxa"/>
+            <w:tcBorders>
+              <w:top w:val="single" w:sz="6" w:space="0" w:color="000000" w:themeColor="text1"/>
+              <w:left w:val="single" w:sz="6" w:space="0" w:color="000000" w:themeColor="text1"/>
+              <w:bottom w:val="single" w:sz="6" w:space="0" w:color="000000" w:themeColor="text1"/>
+              <w:right w:val="single" w:sz="6" w:space="0" w:color="000000" w:themeColor="text1"/>
+            </w:tcBorders>
+            <w:tcMar>
+              <w:top w:w="120" w:type="dxa"/>
+              <w:left w:w="120" w:type="dxa"/>
+              <w:bottom w:w="120" w:type="dxa"/>
+              <w:right w:w="120" w:type="dxa"/>
+            </w:tcMar>
+            <w:vAlign w:val="center"/>
+          </w:tcPr>
+          <w:p>
+            <w:pPr>
+              <w:spacing w:after="0"/>
+            </w:pPr>
+            <w:proofErr w:type="spellStart"/>
+            <w:r>
+              <w:t>I</w:t>
+            </w:r>
+            <w:r>
+              <w:t>d</w:t>
+            </w:r>
+            <w:r>
+              <w:t>_resultado</w:t>
+            </w:r>
+            <w:proofErr w:type="spellEnd"/>
+            <w:r>
+              <w:t xml:space="preserve">, </w:t>
+            </w:r>
+            <w:proofErr w:type="spellStart"/>
+            <w:r>
+              <w:t>sorteio</w:t>
+            </w:r>
+            <w:r>
+              <w:t>_id</w:t>
+            </w:r>
+            <w:proofErr w:type="spellEnd"/>
+            <w:r>
+              <w:t xml:space="preserve">, detalhes, </w:t>
+            </w:r>
+            <w:proofErr w:type="spellStart"/>
+            <w:r>
+              <w:t>comprovante_hash</w:t>
+            </w:r>
+            <w:proofErr w:type="spellEnd"/>
+            <w:r>
+              <w:t xml:space="preserve"> (opcional)</w:t>
+            </w:r>
+          </w:p>
+        </w:tc>
+        <w:tc>
+          <w:tcPr>
+            <w:tcW w:w="2904" w:type="dxa"/>
+            <w:tcBorders>
+              <w:top w:val="single" w:sz="6" w:space="0" w:color="000000" w:themeColor="text1"/>
+              <w:left w:val="single" w:sz="6" w:space="0" w:color="000000" w:themeColor="text1"/>
+              <w:bottom w:val="single" w:sz="6" w:space="0" w:color="000000" w:themeColor="text1"/>
+              <w:right w:val="single" w:sz="6" w:space="0" w:color="000000" w:themeColor="text1"/>
+            </w:tcBorders>
+            <w:tcMar>
+              <w:top w:w="120" w:type="dxa"/>
+              <w:left w:w="120" w:type="dxa"/>
+              <w:bottom w:w="120" w:type="dxa"/>
+              <w:right w:w="120" w:type="dxa"/>
+            </w:tcMar>
+            <w:vAlign w:val="center"/>
+          </w:tcPr>
+          <w:p>
+            <w:pPr>
+              <w:spacing w:after="0"/>
+            </w:pPr>
+            <w:r>
+              <w:t>FK sorteio</w:t>
             </w:r>
           </w:p>
         </w:tc>
@@ -9235,7 +9517,7 @@
         </w:trPr>
         <w:tc>
           <w:tcPr>
-            <w:tcW w:w="1249" w:type="dxa"/>
+            <w:tcW w:w="2899" w:type="dxa"/>
             <w:tcBorders>
               <w:top w:val="single" w:sz="6" w:space="0" w:color="000000" w:themeColor="text1"/>
               <w:left w:val="single" w:sz="6" w:space="0" w:color="000000" w:themeColor="text1"/>
@@ -9259,59 +9541,89 @@
                 <w:b/>
                 <w:bCs/>
               </w:rPr>
-              <w:t>RESULTADO_SORTEIO</w:t>
-            </w:r>
-          </w:p>
-        </w:tc>
-        <w:tc>
-          <w:tcPr>
-            <w:tcW w:w="4409" w:type="dxa"/>
-            <w:tcBorders>
-              <w:top w:val="single" w:sz="6" w:space="0" w:color="000000" w:themeColor="text1"/>
-              <w:left w:val="single" w:sz="6" w:space="0" w:color="000000" w:themeColor="text1"/>
-              <w:bottom w:val="single" w:sz="6" w:space="0" w:color="000000" w:themeColor="text1"/>
-              <w:right w:val="single" w:sz="6" w:space="0" w:color="000000" w:themeColor="text1"/>
-            </w:tcBorders>
-            <w:tcMar>
-              <w:top w:w="120" w:type="dxa"/>
-              <w:left w:w="120" w:type="dxa"/>
-              <w:bottom w:w="120" w:type="dxa"/>
-              <w:right w:w="120" w:type="dxa"/>
-            </w:tcMar>
-            <w:vAlign w:val="center"/>
-          </w:tcPr>
-          <w:p>
-            <w:pPr>
-              <w:spacing w:after="0"/>
-            </w:pPr>
-            <w:r>
-              <w:t>id, id_sorteio, detalhes, comprovante_hash (opcional)</w:t>
-            </w:r>
-          </w:p>
-        </w:tc>
-        <w:tc>
-          <w:tcPr>
-            <w:tcW w:w="3358" w:type="dxa"/>
-            <w:tcBorders>
-              <w:top w:val="single" w:sz="6" w:space="0" w:color="000000" w:themeColor="text1"/>
-              <w:left w:val="single" w:sz="6" w:space="0" w:color="000000" w:themeColor="text1"/>
-              <w:bottom w:val="single" w:sz="6" w:space="0" w:color="000000" w:themeColor="text1"/>
-              <w:right w:val="single" w:sz="6" w:space="0" w:color="000000" w:themeColor="text1"/>
-            </w:tcBorders>
-            <w:tcMar>
-              <w:top w:w="120" w:type="dxa"/>
-              <w:left w:w="120" w:type="dxa"/>
-              <w:bottom w:w="120" w:type="dxa"/>
-              <w:right w:w="120" w:type="dxa"/>
-            </w:tcMar>
-            <w:vAlign w:val="center"/>
-          </w:tcPr>
-          <w:p>
-            <w:pPr>
-              <w:spacing w:after="0"/>
-            </w:pPr>
-            <w:r>
-              <w:t>FK sorteio</w:t>
+              <w:t>HISTORICO_RIFAS</w:t>
+            </w:r>
+          </w:p>
+        </w:tc>
+        <w:tc>
+          <w:tcPr>
+            <w:tcW w:w="3207" w:type="dxa"/>
+            <w:tcBorders>
+              <w:top w:val="single" w:sz="6" w:space="0" w:color="000000" w:themeColor="text1"/>
+              <w:left w:val="single" w:sz="6" w:space="0" w:color="000000" w:themeColor="text1"/>
+              <w:bottom w:val="single" w:sz="6" w:space="0" w:color="000000" w:themeColor="text1"/>
+              <w:right w:val="single" w:sz="6" w:space="0" w:color="000000" w:themeColor="text1"/>
+            </w:tcBorders>
+            <w:tcMar>
+              <w:top w:w="120" w:type="dxa"/>
+              <w:left w:w="120" w:type="dxa"/>
+              <w:bottom w:w="120" w:type="dxa"/>
+              <w:right w:w="120" w:type="dxa"/>
+            </w:tcMar>
+            <w:vAlign w:val="center"/>
+          </w:tcPr>
+          <w:p>
+            <w:pPr>
+              <w:spacing w:after="0"/>
+            </w:pPr>
+            <w:r>
+              <w:t xml:space="preserve">(visão ou tabela de log) </w:t>
+            </w:r>
+            <w:proofErr w:type="spellStart"/>
+            <w:r>
+              <w:t>usuario</w:t>
+            </w:r>
+            <w:r>
+              <w:t>_id</w:t>
+            </w:r>
+            <w:proofErr w:type="spellEnd"/>
+            <w:r>
+              <w:t xml:space="preserve">, </w:t>
+            </w:r>
+            <w:proofErr w:type="spellStart"/>
+            <w:r>
+              <w:t>rifa</w:t>
+            </w:r>
+            <w:r>
+              <w:t>_id</w:t>
+            </w:r>
+            <w:proofErr w:type="spellEnd"/>
+            <w:r>
+              <w:t xml:space="preserve">, </w:t>
+            </w:r>
+            <w:proofErr w:type="spellStart"/>
+            <w:r>
+              <w:t>data_compra</w:t>
+            </w:r>
+            <w:proofErr w:type="spellEnd"/>
+            <w:r>
+              <w:t>, bilhetes</w:t>
+            </w:r>
+          </w:p>
+        </w:tc>
+        <w:tc>
+          <w:tcPr>
+            <w:tcW w:w="2904" w:type="dxa"/>
+            <w:tcBorders>
+              <w:top w:val="single" w:sz="6" w:space="0" w:color="000000" w:themeColor="text1"/>
+              <w:left w:val="single" w:sz="6" w:space="0" w:color="000000" w:themeColor="text1"/>
+              <w:bottom w:val="single" w:sz="6" w:space="0" w:color="000000" w:themeColor="text1"/>
+              <w:right w:val="single" w:sz="6" w:space="0" w:color="000000" w:themeColor="text1"/>
+            </w:tcBorders>
+            <w:tcMar>
+              <w:top w:w="120" w:type="dxa"/>
+              <w:left w:w="120" w:type="dxa"/>
+              <w:bottom w:w="120" w:type="dxa"/>
+              <w:right w:w="120" w:type="dxa"/>
+            </w:tcMar>
+            <w:vAlign w:val="center"/>
+          </w:tcPr>
+          <w:p>
+            <w:pPr>
+              <w:spacing w:after="0"/>
+            </w:pPr>
+            <w:r>
+              <w:t>Pode ser derivada ou materializada</w:t>
             </w:r>
           </w:p>
         </w:tc>
@@ -9322,7 +9634,7 @@
         </w:trPr>
         <w:tc>
           <w:tcPr>
-            <w:tcW w:w="1249" w:type="dxa"/>
+            <w:tcW w:w="2899" w:type="dxa"/>
             <w:tcBorders>
               <w:top w:val="single" w:sz="6" w:space="0" w:color="000000" w:themeColor="text1"/>
               <w:left w:val="single" w:sz="6" w:space="0" w:color="000000" w:themeColor="text1"/>
@@ -9346,59 +9658,59 @@
                 <w:b/>
                 <w:bCs/>
               </w:rPr>
-              <w:t>HISTORICO_RIFAS</w:t>
-            </w:r>
-          </w:p>
-        </w:tc>
-        <w:tc>
-          <w:tcPr>
-            <w:tcW w:w="4409" w:type="dxa"/>
-            <w:tcBorders>
-              <w:top w:val="single" w:sz="6" w:space="0" w:color="000000" w:themeColor="text1"/>
-              <w:left w:val="single" w:sz="6" w:space="0" w:color="000000" w:themeColor="text1"/>
-              <w:bottom w:val="single" w:sz="6" w:space="0" w:color="000000" w:themeColor="text1"/>
-              <w:right w:val="single" w:sz="6" w:space="0" w:color="000000" w:themeColor="text1"/>
-            </w:tcBorders>
-            <w:tcMar>
-              <w:top w:w="120" w:type="dxa"/>
-              <w:left w:w="120" w:type="dxa"/>
-              <w:bottom w:w="120" w:type="dxa"/>
-              <w:right w:w="120" w:type="dxa"/>
-            </w:tcMar>
-            <w:vAlign w:val="center"/>
-          </w:tcPr>
-          <w:p>
-            <w:pPr>
-              <w:spacing w:after="0"/>
-            </w:pPr>
-            <w:r>
-              <w:t>(visão ou tabela de log) id_usuario, id_rifa, data_compra, bilhetes</w:t>
-            </w:r>
-          </w:p>
-        </w:tc>
-        <w:tc>
-          <w:tcPr>
-            <w:tcW w:w="3358" w:type="dxa"/>
-            <w:tcBorders>
-              <w:top w:val="single" w:sz="6" w:space="0" w:color="000000" w:themeColor="text1"/>
-              <w:left w:val="single" w:sz="6" w:space="0" w:color="000000" w:themeColor="text1"/>
-              <w:bottom w:val="single" w:sz="6" w:space="0" w:color="000000" w:themeColor="text1"/>
-              <w:right w:val="single" w:sz="6" w:space="0" w:color="000000" w:themeColor="text1"/>
-            </w:tcBorders>
-            <w:tcMar>
-              <w:top w:w="120" w:type="dxa"/>
-              <w:left w:w="120" w:type="dxa"/>
-              <w:bottom w:w="120" w:type="dxa"/>
-              <w:right w:w="120" w:type="dxa"/>
-            </w:tcMar>
-            <w:vAlign w:val="center"/>
-          </w:tcPr>
-          <w:p>
-            <w:pPr>
-              <w:spacing w:after="0"/>
-            </w:pPr>
-            <w:r>
-              <w:t>Pode ser derivada ou materializada</w:t>
+              <w:t>PAINEL_ADMIN</w:t>
+            </w:r>
+          </w:p>
+        </w:tc>
+        <w:tc>
+          <w:tcPr>
+            <w:tcW w:w="3207" w:type="dxa"/>
+            <w:tcBorders>
+              <w:top w:val="single" w:sz="6" w:space="0" w:color="000000" w:themeColor="text1"/>
+              <w:left w:val="single" w:sz="6" w:space="0" w:color="000000" w:themeColor="text1"/>
+              <w:bottom w:val="single" w:sz="6" w:space="0" w:color="000000" w:themeColor="text1"/>
+              <w:right w:val="single" w:sz="6" w:space="0" w:color="000000" w:themeColor="text1"/>
+            </w:tcBorders>
+            <w:tcMar>
+              <w:top w:w="120" w:type="dxa"/>
+              <w:left w:w="120" w:type="dxa"/>
+              <w:bottom w:w="120" w:type="dxa"/>
+              <w:right w:w="120" w:type="dxa"/>
+            </w:tcMar>
+            <w:vAlign w:val="center"/>
+          </w:tcPr>
+          <w:p>
+            <w:pPr>
+              <w:spacing w:after="0"/>
+            </w:pPr>
+            <w:r>
+              <w:t>(entidade lógica, relacionada a permissões)</w:t>
+            </w:r>
+          </w:p>
+        </w:tc>
+        <w:tc>
+          <w:tcPr>
+            <w:tcW w:w="2904" w:type="dxa"/>
+            <w:tcBorders>
+              <w:top w:val="single" w:sz="6" w:space="0" w:color="000000" w:themeColor="text1"/>
+              <w:left w:val="single" w:sz="6" w:space="0" w:color="000000" w:themeColor="text1"/>
+              <w:bottom w:val="single" w:sz="6" w:space="0" w:color="000000" w:themeColor="text1"/>
+              <w:right w:val="single" w:sz="6" w:space="0" w:color="000000" w:themeColor="text1"/>
+            </w:tcBorders>
+            <w:tcMar>
+              <w:top w:w="120" w:type="dxa"/>
+              <w:left w:w="120" w:type="dxa"/>
+              <w:bottom w:w="120" w:type="dxa"/>
+              <w:right w:w="120" w:type="dxa"/>
+            </w:tcMar>
+            <w:vAlign w:val="center"/>
+          </w:tcPr>
+          <w:p>
+            <w:pPr>
+              <w:spacing w:after="0"/>
+            </w:pPr>
+            <w:r>
+              <w:t>Controle de acesso baseado em papel</w:t>
             </w:r>
           </w:p>
         </w:tc>
@@ -9409,7 +9721,7 @@
         </w:trPr>
         <w:tc>
           <w:tcPr>
-            <w:tcW w:w="1249" w:type="dxa"/>
+            <w:tcW w:w="2899" w:type="dxa"/>
             <w:tcBorders>
               <w:top w:val="single" w:sz="6" w:space="0" w:color="000000" w:themeColor="text1"/>
               <w:left w:val="single" w:sz="6" w:space="0" w:color="000000" w:themeColor="text1"/>
@@ -9433,127 +9745,56 @@
                 <w:b/>
                 <w:bCs/>
               </w:rPr>
-              <w:t>PAINEL_ADMIN</w:t>
-            </w:r>
-          </w:p>
-        </w:tc>
-        <w:tc>
-          <w:tcPr>
-            <w:tcW w:w="4409" w:type="dxa"/>
-            <w:tcBorders>
-              <w:top w:val="single" w:sz="6" w:space="0" w:color="000000" w:themeColor="text1"/>
-              <w:left w:val="single" w:sz="6" w:space="0" w:color="000000" w:themeColor="text1"/>
-              <w:bottom w:val="single" w:sz="6" w:space="0" w:color="000000" w:themeColor="text1"/>
-              <w:right w:val="single" w:sz="6" w:space="0" w:color="000000" w:themeColor="text1"/>
-            </w:tcBorders>
-            <w:tcMar>
-              <w:top w:w="120" w:type="dxa"/>
-              <w:left w:w="120" w:type="dxa"/>
-              <w:bottom w:w="120" w:type="dxa"/>
-              <w:right w:w="120" w:type="dxa"/>
-            </w:tcMar>
-            <w:vAlign w:val="center"/>
-          </w:tcPr>
-          <w:p>
-            <w:pPr>
-              <w:spacing w:after="0"/>
-            </w:pPr>
-            <w:r>
-              <w:t>(entidade lógica, relacionada a permissões)</w:t>
-            </w:r>
-          </w:p>
-        </w:tc>
-        <w:tc>
-          <w:tcPr>
-            <w:tcW w:w="3358" w:type="dxa"/>
-            <w:tcBorders>
-              <w:top w:val="single" w:sz="6" w:space="0" w:color="000000" w:themeColor="text1"/>
-              <w:left w:val="single" w:sz="6" w:space="0" w:color="000000" w:themeColor="text1"/>
-              <w:bottom w:val="single" w:sz="6" w:space="0" w:color="000000" w:themeColor="text1"/>
-              <w:right w:val="single" w:sz="6" w:space="0" w:color="000000" w:themeColor="text1"/>
-            </w:tcBorders>
-            <w:tcMar>
-              <w:top w:w="120" w:type="dxa"/>
-              <w:left w:w="120" w:type="dxa"/>
-              <w:bottom w:w="120" w:type="dxa"/>
-              <w:right w:w="120" w:type="dxa"/>
-            </w:tcMar>
-            <w:vAlign w:val="center"/>
-          </w:tcPr>
-          <w:p>
-            <w:pPr>
-              <w:spacing w:after="0"/>
-            </w:pPr>
-            <w:r>
-              <w:t>Controle de acesso baseado em papel</w:t>
-            </w:r>
-          </w:p>
-        </w:tc>
-      </w:tr>
-      <w:tr>
-        <w:trPr>
-          <w:trHeight w:val="300"/>
-        </w:trPr>
-        <w:tc>
-          <w:tcPr>
-            <w:tcW w:w="1249" w:type="dxa"/>
-            <w:tcBorders>
-              <w:top w:val="single" w:sz="6" w:space="0" w:color="000000" w:themeColor="text1"/>
-              <w:left w:val="single" w:sz="6" w:space="0" w:color="000000" w:themeColor="text1"/>
-              <w:bottom w:val="single" w:sz="6" w:space="0" w:color="000000" w:themeColor="text1"/>
-              <w:right w:val="single" w:sz="6" w:space="0" w:color="000000" w:themeColor="text1"/>
-            </w:tcBorders>
-            <w:tcMar>
-              <w:top w:w="120" w:type="dxa"/>
-              <w:left w:w="120" w:type="dxa"/>
-              <w:bottom w:w="120" w:type="dxa"/>
-              <w:right w:w="120" w:type="dxa"/>
-            </w:tcMar>
-            <w:vAlign w:val="center"/>
-          </w:tcPr>
-          <w:p>
-            <w:pPr>
-              <w:spacing w:after="0"/>
-            </w:pPr>
-            <w:r>
-              <w:rPr>
-                <w:b/>
-                <w:bCs/>
-              </w:rPr>
-              <w:lastRenderedPageBreak/>
               <w:t>NOTIFICACAO</w:t>
             </w:r>
           </w:p>
         </w:tc>
         <w:tc>
           <w:tcPr>
-            <w:tcW w:w="4409" w:type="dxa"/>
-            <w:tcBorders>
-              <w:top w:val="single" w:sz="6" w:space="0" w:color="000000" w:themeColor="text1"/>
-              <w:left w:val="single" w:sz="6" w:space="0" w:color="000000" w:themeColor="text1"/>
-              <w:bottom w:val="single" w:sz="6" w:space="0" w:color="000000" w:themeColor="text1"/>
-              <w:right w:val="single" w:sz="6" w:space="0" w:color="000000" w:themeColor="text1"/>
-            </w:tcBorders>
-            <w:tcMar>
-              <w:top w:w="120" w:type="dxa"/>
-              <w:left w:w="120" w:type="dxa"/>
-              <w:bottom w:w="120" w:type="dxa"/>
-              <w:right w:w="120" w:type="dxa"/>
-            </w:tcMar>
-            <w:vAlign w:val="center"/>
-          </w:tcPr>
-          <w:p>
-            <w:pPr>
-              <w:spacing w:after="0"/>
-            </w:pPr>
-            <w:r>
-              <w:t>id, id_usuario, tipo (email/sms), titulo, mensagem, data_envio, status</w:t>
-            </w:r>
-          </w:p>
-        </w:tc>
-        <w:tc>
-          <w:tcPr>
-            <w:tcW w:w="3358" w:type="dxa"/>
+            <w:tcW w:w="3207" w:type="dxa"/>
+            <w:tcBorders>
+              <w:top w:val="single" w:sz="6" w:space="0" w:color="000000" w:themeColor="text1"/>
+              <w:left w:val="single" w:sz="6" w:space="0" w:color="000000" w:themeColor="text1"/>
+              <w:bottom w:val="single" w:sz="6" w:space="0" w:color="000000" w:themeColor="text1"/>
+              <w:right w:val="single" w:sz="6" w:space="0" w:color="000000" w:themeColor="text1"/>
+            </w:tcBorders>
+            <w:tcMar>
+              <w:top w:w="120" w:type="dxa"/>
+              <w:left w:w="120" w:type="dxa"/>
+              <w:bottom w:w="120" w:type="dxa"/>
+              <w:right w:w="120" w:type="dxa"/>
+            </w:tcMar>
+            <w:vAlign w:val="center"/>
+          </w:tcPr>
+          <w:p>
+            <w:pPr>
+              <w:spacing w:after="0"/>
+            </w:pPr>
+            <w:proofErr w:type="spellStart"/>
+            <w:r>
+              <w:t>I</w:t>
+            </w:r>
+            <w:r>
+              <w:t>d</w:t>
+            </w:r>
+            <w:r>
+              <w:t>_notificacao</w:t>
+            </w:r>
+            <w:proofErr w:type="spellEnd"/>
+            <w:r>
+              <w:t>, usuario</w:t>
+            </w:r>
+            <w:r>
+              <w:t>_id</w:t>
+            </w:r>
+            <w:r>
+              <w:t>, tipo (email/sms), titulo, mensagem, data_envio, status</w:t>
+            </w:r>
+          </w:p>
+        </w:tc>
+        <w:tc>
+          <w:tcPr>
+            <w:tcW w:w="2904" w:type="dxa"/>
             <w:tcBorders>
               <w:top w:val="single" w:sz="6" w:space="0" w:color="000000" w:themeColor="text1"/>
               <w:left w:val="single" w:sz="6" w:space="0" w:color="000000" w:themeColor="text1"/>
@@ -9603,6 +9844,7 @@
         <w:rPr>
           <w:rFonts w:ascii="Consolas" w:eastAsia="Consolas" w:hAnsi="Consolas" w:cs="Consolas"/>
         </w:rPr>
+        <w:lastRenderedPageBreak/>
         <w:t>USUARIO ---&lt; BILHETE &gt;--- RIFA</w:t>
       </w:r>
       <w:r>
@@ -10333,7 +10575,6 @@
               <w:spacing w:after="0"/>
             </w:pPr>
             <w:r>
-              <w:lastRenderedPageBreak/>
               <w:t>RN</w:t>
             </w:r>
             <w:r>
@@ -10492,6 +10733,7 @@
           <w:sz w:val="36"/>
           <w:szCs w:val="36"/>
         </w:rPr>
+        <w:lastRenderedPageBreak/>
         <w:t>8. Matriz de rastreabilidade (exemplo)</w:t>
       </w:r>
     </w:p>
@@ -10507,10 +10749,10 @@
         <w:tblLook w:val="06A0" w:firstRow="1" w:lastRow="0" w:firstColumn="1" w:lastColumn="0" w:noHBand="1" w:noVBand="1"/>
       </w:tblPr>
       <w:tblGrid>
-        <w:gridCol w:w="1334"/>
-        <w:gridCol w:w="2383"/>
-        <w:gridCol w:w="3016"/>
-        <w:gridCol w:w="2277"/>
+        <w:gridCol w:w="1282"/>
+        <w:gridCol w:w="2397"/>
+        <w:gridCol w:w="3038"/>
+        <w:gridCol w:w="2293"/>
       </w:tblGrid>
       <w:tr>
         <w:trPr>
@@ -11229,10 +11471,10 @@
         <w:tblLook w:val="06A0" w:firstRow="1" w:lastRow="0" w:firstColumn="1" w:lastColumn="0" w:noHBand="1" w:noVBand="1"/>
       </w:tblPr>
       <w:tblGrid>
-        <w:gridCol w:w="854"/>
-        <w:gridCol w:w="1820"/>
-        <w:gridCol w:w="1721"/>
-        <w:gridCol w:w="4615"/>
+        <w:gridCol w:w="827"/>
+        <w:gridCol w:w="1819"/>
+        <w:gridCol w:w="1717"/>
+        <w:gridCol w:w="4647"/>
       </w:tblGrid>
       <w:tr>
         <w:trPr>
@@ -11607,7 +11849,6 @@
               <w:spacing w:after="0"/>
             </w:pPr>
             <w:r>
-              <w:lastRenderedPageBreak/>
               <w:t>UC03</w:t>
             </w:r>
           </w:p>
@@ -12044,6 +12285,7 @@
               <w:spacing w:after="0"/>
             </w:pPr>
             <w:r>
+              <w:lastRenderedPageBreak/>
               <w:t>UC07</w:t>
             </w:r>
           </w:p>
@@ -12273,17 +12515,7 @@
           <w:b/>
           <w:bCs/>
         </w:rPr>
-        <w:t xml:space="preserve">l – </w:t>
-      </w:r>
-      <w:bookmarkStart w:id="0" w:name="_GoBack"/>
-      <w:bookmarkEnd w:id="0"/>
-      <w:r>
-        <w:rPr>
-          <w:rFonts w:ascii="Aptos" w:eastAsia="Aptos" w:hAnsi="Aptos" w:cs="Aptos"/>
-          <w:b/>
-          <w:bCs/>
-        </w:rPr>
-        <w:t>2 semanas</w:t>
+        <w:t>l – 2 semanas</w:t>
       </w:r>
       <w:r>
         <w:rPr>
@@ -12628,7 +12860,6 @@
         <w:rPr>
           <w:rFonts w:ascii="Aptos" w:eastAsia="Aptos" w:hAnsi="Aptos" w:cs="Aptos"/>
         </w:rPr>
-        <w:lastRenderedPageBreak/>
         <w:t>Melhorias em relatórios e BI.</w:t>
       </w:r>
     </w:p>
@@ -12646,7 +12877,7 @@
 </file>
 
 <file path=word/numbering.xml><?xml version="1.0" encoding="utf-8"?>
-<w:numbering xmlns:wpc="http://schemas.microsoft.com/office/word/2010/wordprocessingCanvas" xmlns:cx="http://schemas.microsoft.com/office/drawing/2014/chartex" xmlns:mc="http://schemas.openxmlformats.org/markup-compatibility/2006" xmlns:o="urn:schemas-microsoft-com:office:office" xmlns:r="http://schemas.openxmlformats.org/officeDocument/2006/relationships" xmlns:m="http://schemas.openxmlformats.org/officeDocument/2006/math" xmlns:v="urn:schemas-microsoft-com:vml" xmlns:wp14="http://schemas.microsoft.com/office/word/2010/wordprocessingDrawing" xmlns:wp="http://schemas.openxmlformats.org/drawingml/2006/wordprocessingDrawing" xmlns:w10="urn:schemas-microsoft-com:office:word" xmlns:w="http://schemas.openxmlformats.org/wordprocessingml/2006/main" xmlns:w14="http://schemas.microsoft.com/office/word/2010/wordml" xmlns:w15="http://schemas.microsoft.com/office/word/2012/wordml" xmlns:w16se="http://schemas.microsoft.com/office/word/2015/wordml/symex" xmlns:wpg="http://schemas.microsoft.com/office/word/2010/wordprocessingGroup" xmlns:wpi="http://schemas.microsoft.com/office/word/2010/wordprocessingInk" xmlns:wne="http://schemas.microsoft.com/office/word/2006/wordml" xmlns:wps="http://schemas.microsoft.com/office/word/2010/wordprocessingShape" mc:Ignorable="w14 w15 w16se wp14">
+<w:numbering xmlns:wpc="http://schemas.microsoft.com/office/word/2010/wordprocessingCanvas" xmlns:cx="http://schemas.microsoft.com/office/drawing/2014/chartex" xmlns:cx1="http://schemas.microsoft.com/office/drawing/2015/9/8/chartex" xmlns:cx2="http://schemas.microsoft.com/office/drawing/2015/10/21/chartex" xmlns:cx3="http://schemas.microsoft.com/office/drawing/2016/5/9/chartex" xmlns:cx4="http://schemas.microsoft.com/office/drawing/2016/5/10/chartex" xmlns:cx5="http://schemas.microsoft.com/office/drawing/2016/5/11/chartex" xmlns:cx6="http://schemas.microsoft.com/office/drawing/2016/5/12/chartex" xmlns:cx7="http://schemas.microsoft.com/office/drawing/2016/5/13/chartex" xmlns:cx8="http://schemas.microsoft.com/office/drawing/2016/5/14/chartex" xmlns:mc="http://schemas.openxmlformats.org/markup-compatibility/2006" xmlns:aink="http://schemas.microsoft.com/office/drawing/2016/ink" xmlns:am3d="http://schemas.microsoft.com/office/drawing/2017/model3d" xmlns:o="urn:schemas-microsoft-com:office:office" xmlns:oel="http://schemas.microsoft.com/office/2019/extlst" xmlns:r="http://schemas.openxmlformats.org/officeDocument/2006/relationships" xmlns:m="http://schemas.openxmlformats.org/officeDocument/2006/math" xmlns:v="urn:schemas-microsoft-com:vml" xmlns:wp14="http://schemas.microsoft.com/office/word/2010/wordprocessingDrawing" xmlns:wp="http://schemas.openxmlformats.org/drawingml/2006/wordprocessingDrawing" xmlns:w10="urn:schemas-microsoft-com:office:word" xmlns:w="http://schemas.openxmlformats.org/wordprocessingml/2006/main" xmlns:w14="http://schemas.microsoft.com/office/word/2010/wordml" xmlns:w15="http://schemas.microsoft.com/office/word/2012/wordml" xmlns:w16cex="http://schemas.microsoft.com/office/word/2018/wordml/cex" xmlns:w16cid="http://schemas.microsoft.com/office/word/2016/wordml/cid" xmlns:w16="http://schemas.microsoft.com/office/word/2018/wordml" xmlns:w16sdtdh="http://schemas.microsoft.com/office/word/2020/wordml/sdtdatahash" xmlns:w16se="http://schemas.microsoft.com/office/word/2015/wordml/symex" xmlns:wpg="http://schemas.microsoft.com/office/word/2010/wordprocessingGroup" xmlns:wpi="http://schemas.microsoft.com/office/word/2010/wordprocessingInk" xmlns:wne="http://schemas.microsoft.com/office/word/2006/wordml" xmlns:wps="http://schemas.microsoft.com/office/word/2010/wordprocessingShape" mc:Ignorable="w14 w15 w16se w16cid w16 w16cex w16sdtdh wp14">
   <w:abstractNum w:abstractNumId="0" w15:restartNumberingAfterBreak="0">
     <w:nsid w:val="0AF94FB6"/>
     <w:multiLevelType w:val="hybridMultilevel"/>
@@ -13298,29 +13529,29 @@
       </w:rPr>
     </w:lvl>
   </w:abstractNum>
-  <w:num w:numId="1">
+  <w:num w:numId="1" w16cid:durableId="219900547">
     <w:abstractNumId w:val="3"/>
   </w:num>
-  <w:num w:numId="2">
+  <w:num w:numId="2" w16cid:durableId="1088424798">
     <w:abstractNumId w:val="1"/>
   </w:num>
-  <w:num w:numId="3">
+  <w:num w:numId="3" w16cid:durableId="236403158">
     <w:abstractNumId w:val="0"/>
   </w:num>
-  <w:num w:numId="4">
+  <w:num w:numId="4" w16cid:durableId="1143424958">
     <w:abstractNumId w:val="4"/>
   </w:num>
-  <w:num w:numId="5">
+  <w:num w:numId="5" w16cid:durableId="1168902440">
     <w:abstractNumId w:val="5"/>
   </w:num>
-  <w:num w:numId="6">
+  <w:num w:numId="6" w16cid:durableId="1640722546">
     <w:abstractNumId w:val="2"/>
   </w:num>
 </w:numbering>
 </file>
 
 <file path=word/styles.xml><?xml version="1.0" encoding="utf-8"?>
-<w:styles xmlns:mc="http://schemas.openxmlformats.org/markup-compatibility/2006" xmlns:r="http://schemas.openxmlformats.org/officeDocument/2006/relationships" xmlns:w="http://schemas.openxmlformats.org/wordprocessingml/2006/main" xmlns:w14="http://schemas.microsoft.com/office/word/2010/wordml" xmlns:w15="http://schemas.microsoft.com/office/word/2012/wordml" xmlns:w16se="http://schemas.microsoft.com/office/word/2015/wordml/symex" mc:Ignorable="w14 w15 w16se">
+<w:styles xmlns:mc="http://schemas.openxmlformats.org/markup-compatibility/2006" xmlns:r="http://schemas.openxmlformats.org/officeDocument/2006/relationships" xmlns:w="http://schemas.openxmlformats.org/wordprocessingml/2006/main" xmlns:w14="http://schemas.microsoft.com/office/word/2010/wordml" xmlns:w15="http://schemas.microsoft.com/office/word/2012/wordml" xmlns:w16cex="http://schemas.microsoft.com/office/word/2018/wordml/cex" xmlns:w16cid="http://schemas.microsoft.com/office/word/2016/wordml/cid" xmlns:w16="http://schemas.microsoft.com/office/word/2018/wordml" xmlns:w16sdtdh="http://schemas.microsoft.com/office/word/2020/wordml/sdtdatahash" xmlns:w16se="http://schemas.microsoft.com/office/word/2015/wordml/symex" mc:Ignorable="w14 w15 w16se w16cid w16 w16cex w16sdtdh">
   <w:docDefaults>
     <w:rPrDefault>
       <w:rPr>
@@ -13336,7 +13567,7 @@
       </w:pPr>
     </w:pPrDefault>
   </w:docDefaults>
-  <w:latentStyles w:defLockedState="0" w:defUIPriority="99" w:defSemiHidden="0" w:defUnhideWhenUsed="0" w:defQFormat="0" w:count="371">
+  <w:latentStyles w:defLockedState="0" w:defUIPriority="99" w:defSemiHidden="0" w:defUnhideWhenUsed="0" w:defQFormat="0" w:count="376">
     <w:lsdException w:name="Normal" w:uiPriority="0" w:qFormat="1"/>
     <w:lsdException w:name="heading 1" w:uiPriority="9" w:qFormat="1"/>
     <w:lsdException w:name="heading 2" w:semiHidden="1" w:uiPriority="9" w:unhideWhenUsed="1" w:qFormat="1"/>
@@ -13708,6 +13939,11 @@
     <w:lsdException w:name="List Table 5 Dark Accent 6" w:uiPriority="50"/>
     <w:lsdException w:name="List Table 6 Colorful Accent 6" w:uiPriority="51"/>
     <w:lsdException w:name="List Table 7 Colorful Accent 6" w:uiPriority="52"/>
+    <w:lsdException w:name="Mention" w:semiHidden="1" w:unhideWhenUsed="1"/>
+    <w:lsdException w:name="Smart Hyperlink" w:semiHidden="1" w:unhideWhenUsed="1"/>
+    <w:lsdException w:name="Hashtag" w:semiHidden="1" w:unhideWhenUsed="1"/>
+    <w:lsdException w:name="Unresolved Mention" w:semiHidden="1" w:unhideWhenUsed="1"/>
+    <w:lsdException w:name="Smart Link" w:semiHidden="1" w:unhideWhenUsed="1"/>
   </w:latentStyles>
   <w:style w:type="paragraph" w:default="1" w:styleId="Normal">
     <w:name w:val="Normal"/>

</xml_diff>